<commit_message>
new figures - jeremy's outline
</commit_message>
<xml_diff>
--- a/manuscript_narrative/galaxy-oriented/Galaxy_agents_workbench_oriented_manuscript.docx
+++ b/manuscript_narrative/galaxy-oriented/Galaxy_agents_workbench_oriented_manuscript.docx
@@ -66,7 +66,7 @@
         <w:rPr>
           <w:rFonts w:ascii="Arial" w:cs="Arial" w:eastAsia="Arial" w:hAnsi="Arial"/>
         </w:rPr>
-        <w:t xml:space="preserve">Scientific workbenches are being connected to AI agents, but it is unclear what a workbench must expose for an agent's intended analysis to be executed faithfully, its failures diagnosed and its results attributed. We audited 2,070 archived agent runs that performed three biomedical benchmarks on usegalaxy.org through one Model Context Protocol interface, comprising 69,505 interface calls and 23,080 Galaxy jobs. Of these calls, 11.5% met an exception or job-failure rule; error categories did not uniquely identify phase, and failed-job excerpts frequently lacked diagnostics. Requested and resolved parameters were compared and matched in 43% to 56% of installed-tool run calls. Tool discovery accounted for 43% to 70% of the text the interface returned. A third or more of shell commands in Galaxy-arm runs called the Galaxy API directly, outside the interface's checks. We report eight baseline measures and six requirements, each to be tested prospectively.</w:t>
+        <w:t xml:space="preserve">Scientific workbenches are being connected to AI agents. However, it is unclear what a workbench must expose so that an agent's intended analysis is executed faithfully, its failures are diagnosed and its results are attributed. To address this gap, we audited 2,070 archived agent runs that performed three biomedical benchmarks on usegalaxy.org through one Model Context Protocol interface, comprising 69,505 interface calls and 23,080 Galaxy jobs. Of these calls, 11.5% met an exception or job-failure rule. Error categories did not uniquely identify phase, and failed-job excerpts frequently lacked diagnostics. Requested and resolved parameters were compared and matched in 43% to 56% of installed-tool run calls. Tool discovery accounted for 43% to 70% of returned text. A third or more of shell commands in Galaxy-arm runs called the Galaxy API directly, outside the interface's checks. We derive eight baseline measures and six requirements, each to be tested prospectively.</w:t>
       </w:r>
     </w:p>
     <w:p>
@@ -90,27 +90,27 @@
         <w:rPr>
           <w:rFonts w:ascii="Arial" w:cs="Arial" w:eastAsia="Arial" w:hAnsi="Arial"/>
         </w:rPr>
-        <w:t xml:space="preserve">. Most agent benchmarks score the final answer</w:t>
+        <w:t xml:space="preserve">, and the uncritical adoption of AI in science has prompted calls for guard rails</w:t>
       </w:r>
       <w:r>
         <w:rPr>
           <w:rFonts w:ascii="Arial" w:cs="Arial" w:eastAsia="Arial" w:hAnsi="Arial"/>
           <w:vertAlign w:val="superscript"/>
         </w:rPr>
-        <w:t xml:space="preserve">5–7</w:t>
-      </w:r>
-      <w:r>
-        <w:rPr>
-          <w:rFonts w:ascii="Arial" w:cs="Arial" w:eastAsia="Arial" w:hAnsi="Arial"/>
-        </w:rPr>
-        <w:t xml:space="preserve">, so they say little about the software the agent works through. Scientific workbenches such as Galaxy</w:t>
+        <w:t xml:space="preserve">5</w:t>
+      </w:r>
+      <w:r>
+        <w:rPr>
+          <w:rFonts w:ascii="Arial" w:cs="Arial" w:eastAsia="Arial" w:hAnsi="Arial"/>
+        </w:rPr>
+        <w:t xml:space="preserve">. Scientific workbenches such as Galaxy</w:t>
       </w:r>
       <w:r>
         <w:rPr>
           <w:rFonts w:ascii="Arial" w:cs="Arial" w:eastAsia="Arial" w:hAnsi="Arial"/>
           <w:vertAlign w:val="superscript"/>
         </w:rPr>
-        <w:t xml:space="preserve">8,9</w:t>
+        <w:t xml:space="preserve">6,7</w:t>
       </w:r>
       <w:r>
         <w:rPr>
@@ -123,7 +123,7 @@
           <w:rFonts w:ascii="Arial" w:cs="Arial" w:eastAsia="Arial" w:hAnsi="Arial"/>
           <w:vertAlign w:val="superscript"/>
         </w:rPr>
-        <w:t xml:space="preserve">10–12</w:t>
+        <w:t xml:space="preserve">8–10</w:t>
       </w:r>
       <w:r>
         <w:rPr>
@@ -136,7 +136,7 @@
           <w:rFonts w:ascii="Arial" w:cs="Arial" w:eastAsia="Arial" w:hAnsi="Arial"/>
           <w:vertAlign w:val="superscript"/>
         </w:rPr>
-        <w:t xml:space="preserve">13,14</w:t>
+        <w:t xml:space="preserve">11,12</w:t>
       </w:r>
       <w:r>
         <w:rPr>
@@ -149,37 +149,50 @@
           <w:rFonts w:ascii="Arial" w:cs="Arial" w:eastAsia="Arial" w:hAnsi="Arial"/>
           <w:vertAlign w:val="superscript"/>
         </w:rPr>
-        <w:t xml:space="preserve">15–19</w:t>
-      </w:r>
-      <w:r>
-        <w:rPr>
-          <w:rFonts w:ascii="Arial" w:cs="Arial" w:eastAsia="Arial" w:hAnsi="Arial"/>
-        </w:rPr>
-        <w:t xml:space="preserve">. These guarantees were designed for human users. An agent instead discovers tools from text, fills parameters from schemas, interprets job states and decides when to retry. Where that interaction fails, the workbench's guarantees may not reach the analysis that is actually run. Studies of agent failures in general software settings point to the same interface between the model and its tools</w:t>
+        <w:t xml:space="preserve">13–17</w:t>
+      </w:r>
+      <w:r>
+        <w:rPr>
+          <w:rFonts w:ascii="Arial" w:cs="Arial" w:eastAsia="Arial" w:hAnsi="Arial"/>
+        </w:rPr>
+        <w:t xml:space="preserve">. However, these guarantees were designed for human users. An agent instead discovers tools from text, fills parameters from schemas, interprets job states and decides when to retry. Where that interaction fails, the workbench's guarantees may not reach the analysis that is actually run. Studies of agent failures in general software settings point to the same interface between the model and its tools</w:t>
       </w:r>
       <w:r>
         <w:rPr>
           <w:rFonts w:ascii="Arial" w:cs="Arial" w:eastAsia="Arial" w:hAnsi="Arial"/>
           <w:vertAlign w:val="superscript"/>
         </w:rPr>
-        <w:t xml:space="preserve">20–22</w:t>
-      </w:r>
-      <w:r>
-        <w:rPr>
-          <w:rFonts w:ascii="Arial" w:cs="Arial" w:eastAsia="Arial" w:hAnsi="Arial"/>
-        </w:rPr>
-        <w:t xml:space="preserve">.</w:t>
-      </w:r>
-    </w:p>
-    <w:p>
-      <w:pPr>
-        <w:spacing w:after="160" w:line="360"/>
-      </w:pPr>
-      <w:r>
-        <w:rPr>
-          <w:rFonts w:ascii="Arial" w:cs="Arial" w:eastAsia="Arial" w:hAnsi="Arial"/>
-        </w:rPr>
-        <w:t xml:space="preserve">Here we treat Galaxy as the system under test and ask what a workbench must expose so that an agent's intended analysis is faithfully executed, diagnosably recoverable and attributable. We analysed every Galaxy-arm run in a paired benchmark archive, interface call by interface call and job by job. Runs from the archive's open-ended code arm provide descriptive token comparisons; the observational design does not isolate a causal workbench effect. A companion manuscript uses the same archive to compare accuracy and repeatability between execution arms from a user's perspective </w:t>
+        <w:t xml:space="preserve">18–20</w:t>
+      </w:r>
+      <w:r>
+        <w:rPr>
+          <w:rFonts w:ascii="Arial" w:cs="Arial" w:eastAsia="Arial" w:hAnsi="Arial"/>
+        </w:rPr>
+        <w:t xml:space="preserve">. Yet most agent benchmarks score the final answer</w:t>
+      </w:r>
+      <w:r>
+        <w:rPr>
+          <w:rFonts w:ascii="Arial" w:cs="Arial" w:eastAsia="Arial" w:hAnsi="Arial"/>
+          <w:vertAlign w:val="superscript"/>
+        </w:rPr>
+        <w:t xml:space="preserve">21–23</w:t>
+      </w:r>
+      <w:r>
+        <w:rPr>
+          <w:rFonts w:ascii="Arial" w:cs="Arial" w:eastAsia="Arial" w:hAnsi="Arial"/>
+        </w:rPr>
+        <w:t xml:space="preserve">, so they say little about the software the agent works through.</w:t>
+      </w:r>
+    </w:p>
+    <w:p>
+      <w:pPr>
+        <w:spacing w:after="160" w:line="360"/>
+      </w:pPr>
+      <w:r>
+        <w:rPr>
+          <w:rFonts w:ascii="Arial" w:cs="Arial" w:eastAsia="Arial" w:hAnsi="Arial"/>
+        </w:rPr>
+        <w:t xml:space="preserve">To address this gap, we treat Galaxy as the system under test and ask what a workbench must expose so that an agent's intended analysis is (1) faithfully executed, (2) diagnosably recoverable and (3) attributable. We analysed every Galaxy-arm run in a paired benchmark archive, interface call by interface call and job by job, and used the archive's open-ended code arm for descriptive token comparisons. We show where Galaxy's guarantees did not reach the executed analysis and derive baselines for prospective intervention studies. A companion manuscript uses the same archive to compare accuracy and repeatability between execution arms from a user's perspective </w:t>
       </w:r>
       <w:r>
         <w:rPr>
@@ -193,7 +206,7 @@
         <w:rPr>
           <w:rFonts w:ascii="Arial" w:cs="Arial" w:eastAsia="Arial" w:hAnsi="Arial"/>
         </w:rPr>
-        <w:t xml:space="preserve">. The two papers share some descriptive measures, such as token use, but answer different questions, and neither depends on the other's conclusions. All measurements describe the archived Galaxy interface deployments and one public server in July to September 2026. They are baselines for prospective intervention studies, not estimates for other deployments.</w:t>
+        <w:t xml:space="preserve">. The two papers share some descriptive measures, such as token use, but answer different questions, and neither depends on the other's conclusions. All measurements describe the archived Galaxy interface deployments on one public server in July to September 2026; they are not estimates for other deployments.</w:t>
       </w:r>
     </w:p>
     <w:p>
@@ -225,29 +238,29 @@
           <w:sz w:val="23"/>
           <w:szCs w:val="23"/>
         </w:rPr>
-        <w:t xml:space="preserve">System layers, the provenance boundary and the evidence analysed</w:t>
-      </w:r>
-    </w:p>
-    <w:p>
-      <w:pPr>
-        <w:spacing w:after="160" w:line="360"/>
-      </w:pPr>
-      <w:r>
-        <w:rPr>
-          <w:rFonts w:ascii="Arial" w:cs="Arial" w:eastAsia="Arial" w:hAnsi="Arial"/>
-        </w:rPr>
-        <w:t xml:space="preserve">Agents reached usegalaxy.org through a Galaxy interface adapter built on the Model Context Protocol (https://modelcontextprotocol.io; Fig. 1a). The adapter exposed tool search and inspection, history and dataset inspection, runs of installed tools, runs of user-defined tools and waits for jobs. User-defined tools are agent-written code that Galaxy runs as a job in a declared container. Before submitting a run, the adapter validated the request against the tool state that Galaxy would build; after the job, it compared the requested parameters with those Galaxy had recorded. Galaxy's job records and analysis histories form a provenance boundary: computation inside it is recorded with tool identity, version, parameters and datasets. The agent also had a local shell for staging and answer extraction. Everything done there, including any direct call to the Galaxy API, bypassed the adapter's checks. Extended Data Fig. 1 shows how often runs used each capability.</w:t>
-      </w:r>
-    </w:p>
-    <w:p>
-      <w:pPr>
-        <w:spacing w:after="160" w:line="360"/>
-      </w:pPr>
-      <w:r>
-        <w:rPr>
-          <w:rFonts w:ascii="Arial" w:cs="Arial" w:eastAsia="Arial" w:hAnsi="Arial"/>
-        </w:rPr>
-        <w:t xml:space="preserve">The evidence comprises 2,070 Galaxy-arm runs on BixBench-Verified-50, CompBioBench and IWC, of which 2,058 have parsed execution traces and 2,030 have detailed analysis histories (Fig. 1b; Supplementary Table 1). The parsed calls comprise 69,505 Galaxy-interface calls and 23,080 analysis jobs. We excluded 307 calls to client built-ins and external connectors from all interface measures. Runs took place from 15 July to 17 August 2026 for BixBench-Verified-50, 3 August to 28 August 2026 for CompBioBench and 27 August to 3 September 2026 for IWC, and BixBench-Verified-50 runs used 7 harness or image labels. Tool versions and the server's catalogue were those current at run time, and we could not freeze them retrospectively.</w:t>
+        <w:t xml:space="preserve">Auditing agent runs across the Galaxy interface and its provenance boundary</w:t>
+      </w:r>
+    </w:p>
+    <w:p>
+      <w:pPr>
+        <w:spacing w:after="160" w:line="360"/>
+      </w:pPr>
+      <w:r>
+        <w:rPr>
+          <w:rFonts w:ascii="Arial" w:cs="Arial" w:eastAsia="Arial" w:hAnsi="Arial"/>
+        </w:rPr>
+        <w:t xml:space="preserve">Agents reached usegalaxy.org through a Galaxy interface adapter built on the Model Context Protocol (https://modelcontextprotocol.io; Fig. 1a). The adapter exposed tool search and inspection, history and dataset inspection, runs of installed tools, runs of user-defined tools and waits for jobs. User-defined tools are agent-written code that Galaxy runs as a job in a declared container. Before submitting a run, the adapter validated the request against the tool state that Galaxy would build. After the job, it compared the requested parameters with those Galaxy had recorded. Galaxy's job records and analysis histories form a provenance boundary—computation inside it is recorded with tool identity, version, parameters and datasets. The agent also had a local shell for staging and answer extraction. Everything done there, including any direct call to the Galaxy API, bypassed the adapter's checks. Extended Data Fig. 1 shows how often runs used each capability.</w:t>
+      </w:r>
+    </w:p>
+    <w:p>
+      <w:pPr>
+        <w:spacing w:after="160" w:line="360"/>
+      </w:pPr>
+      <w:r>
+        <w:rPr>
+          <w:rFonts w:ascii="Arial" w:cs="Arial" w:eastAsia="Arial" w:hAnsi="Arial"/>
+        </w:rPr>
+        <w:t xml:space="preserve">We analysed 2,070 Galaxy-arm runs on BixBench-Verified-50, CompBioBench and IWC. Of these, 2,058 have parsed execution traces and 2,030 have detailed analysis histories (Fig. 1b; Supplementary Table 1). The parsed calls comprise 69,505 Galaxy-interface calls and 23,080 analysis jobs. We excluded 307 calls to client built-ins and external connectors from all interface measures. Runs took place from 15 July to 17 August 2026 for BixBench-Verified-50, 3 August to 28 August 2026 for CompBioBench and 27 August to 3 September 2026 for IWC, and BixBench-Verified-50 runs used 7 harness or image labels. These records separate adapter checks, Galaxy provenance and shell activity.</w:t>
       </w:r>
     </w:p>
     <w:p>
@@ -263,62 +276,62 @@
           <w:sz w:val="23"/>
           <w:szCs w:val="23"/>
         </w:rPr>
-        <w:t xml:space="preserve">Failed interactions, diagnostic content and operational recovery</w:t>
-      </w:r>
-    </w:p>
-    <w:p>
-      <w:pPr>
-        <w:spacing w:after="160" w:line="360"/>
-      </w:pPr>
-      <w:r>
-        <w:rPr>
-          <w:rFonts w:ascii="Arial" w:cs="Arial" w:eastAsia="Arial" w:hAnsi="Arial"/>
-        </w:rPr>
-        <w:t xml:space="preserve">Of 69,505 Galaxy-interface calls, 7,987 (11.5%) failed: 1,975 of 17,422 (11.3%) on BixBench-Verified-50, 5,593 of 48,131 (11.6%) on CompBioBench and 419 of 3,952 (10.6%) on IWC (Fig. 2a). The ordered taxonomy assigned 3,454 (43.2%) to interface, input or transport classes (A). These categories do not establish phase: 22 A-class calls returned job records. A further 604 were transport or tool exceptions omitted by the earlier failure rule; these include adapter validation and exceptions from Galaxy HTTP responses, so their origin is not uniformly pre-server. Another 3,675 (46.0%) entered job/tool classes (B), and 254 remained unclassified. Failure rates and interaction styles differed between model configurations (Extended Data Fig. 2). The archived failure ledger counted 7,389 failures, including 258 unclassified. It also included 6 calls to non-Galaxy tool servers, 4 of them unclassified, which we excluded (Supplementary Table 2).</w:t>
-      </w:r>
-    </w:p>
-    <w:p>
-      <w:pPr>
-        <w:spacing w:after="160" w:line="360"/>
-      </w:pPr>
-      <w:r>
-        <w:rPr>
-          <w:rFonts w:ascii="Arial" w:cs="Arial" w:eastAsia="Arial" w:hAnsi="Arial"/>
-        </w:rPr>
-        <w:t xml:space="preserve">The largest single class was missing or unusable history context (1,340 calls). In 1,132 of these calls, a tool schema was requested without any history, and in 208 the history supplied could not be used. Galaxy builds a tool's parameter schema in the context of a history, so a request for a tool's interface without a usable history fails although nothing about the tool has changed. Other interface/input classes included parameter values or datatypes that Galaxy rejected, guessed tool identifiers, misused dataset or history identifiers and nested parameter structures that did not match the schema.</w:t>
-      </w:r>
-    </w:p>
-    <w:p>
-      <w:pPr>
-        <w:spacing w:after="160" w:line="360"/>
-      </w:pPr>
-      <w:r>
-        <w:rPr>
-          <w:rFonts w:ascii="Arial" w:cs="Arial" w:eastAsia="Arial" w:hAnsi="Arial"/>
-        </w:rPr>
-        <w:t xml:space="preserve">About half of tool-run calls returned ok, and retries were not consistently more successful than first attempts (Fig. 2b); 44% of run calls were first attempts at that tool in the run.</w:t>
-      </w:r>
-    </w:p>
-    <w:p>
-      <w:pPr>
-        <w:spacing w:after="160" w:line="360"/>
-      </w:pPr>
-      <w:r>
-        <w:rPr>
-          <w:rFonts w:ascii="Arial" w:cs="Arial" w:eastAsia="Arial" w:hAnsi="Arial"/>
-        </w:rPr>
-        <w:t xml:space="preserve">Returned excerpts often lacked diagnostic indicators when a job failed (Fig. 2c). Of failed user-defined-tool calls classified before execution, 1,320 of 1,320 lacked a diagnostic indicator in the extracted excerpt, as did nearly all equivalent installed-tool calls. For runtime failures, 472 of 2,010 lacked such an indicator. This excerpt screen is a proxy for diagnostic visibility, not verification of complete result contents. The largest post-job class was a failed job with no diagnostic text (1,829 calls). Server-side causes were also hidden. On CompBioBench, 510 of 2,262 failed user-defined-tool calls occurred in the 72 runs whose traces show that Galaxy had no execution destination available. The interface never relayed that message; agents saw it only through the shell (Extended Data Fig. 3).</w:t>
-      </w:r>
-    </w:p>
-    <w:p>
-      <w:pPr>
-        <w:spacing w:after="160" w:line="360"/>
-      </w:pPr>
-      <w:r>
-        <w:rPr>
-          <w:rFonts w:ascii="Arial" w:cs="Arial" w:eastAsia="Arial" w:hAnsi="Arial"/>
-        </w:rPr>
-        <w:t xml:space="preserve">We followed non-ok tool-call episodes: the first non-ok call and subsequent calls of that tool family within a run, treating all user-defined tools as one family (Fig. 2d). This includes caught mismatches, timeouts and failed jobs. A later call returned ok in 58%, 49% and 44% of scored episodes. Final benchmark acceptance was assessed separately. Neither later ok nor acceptance establishes repair of the failed step or retention of the same scientific goal; episodes without grades are reported separately in Source Data.</w:t>
+        <w:t xml:space="preserve">Failed Galaxy interactions often lacked diagnostics</w:t>
+      </w:r>
+    </w:p>
+    <w:p>
+      <w:pPr>
+        <w:spacing w:after="160" w:line="360"/>
+      </w:pPr>
+      <w:r>
+        <w:rPr>
+          <w:rFonts w:ascii="Arial" w:cs="Arial" w:eastAsia="Arial" w:hAnsi="Arial"/>
+        </w:rPr>
+        <w:t xml:space="preserve">Of 69,505 Galaxy-interface calls, 7,987 (11.5%) failed: 1,975 of 17,422 (11.3%) on BixBench-Verified-50, 5,593 of 48,131 (11.6%) on CompBioBench and 419 of 3,952 (10.6%) on IWC (Fig. 2a). The ordered taxonomy assigned 3,454 (43.2%) to interface, input or transport classes (A), 3,675 (46.0%) to job/tool classes (B) and left 254 unclassified. These categories do not establish phase: 22 A-class calls returned job records. A further 604 were transport or tool exceptions omitted by the earlier failure rule. They include adapter validation and exceptions from Galaxy HTTP responses, so their origin is not uniformly pre-server. Failure rates and interaction styles differed between model configurations (Extended Data Fig. 2). The archived failure ledger counted 7,389 failures, including 258 unclassified. We excluded its 6 calls to non-Galaxy tool servers, 4 of them unclassified (Supplementary Table 2).</w:t>
+      </w:r>
+    </w:p>
+    <w:p>
+      <w:pPr>
+        <w:spacing w:after="160" w:line="360"/>
+      </w:pPr>
+      <w:r>
+        <w:rPr>
+          <w:rFonts w:ascii="Arial" w:cs="Arial" w:eastAsia="Arial" w:hAnsi="Arial"/>
+        </w:rPr>
+        <w:t xml:space="preserve">The largest single class was missing or unusable history context (1,340 calls). In 1,132 of these calls, a tool schema was requested without any history; in 208, the history supplied could not be used. Galaxy builds a tool's parameter schema in the context of a history. A request for a tool's interface without a usable history therefore fails, although nothing about the tool has changed. Other interface/input classes included parameter values or datatypes that Galaxy rejected, guessed tool identifiers, misused dataset or history identifiers and nested parameter structures that did not match the schema.</w:t>
+      </w:r>
+    </w:p>
+    <w:p>
+      <w:pPr>
+        <w:spacing w:after="160" w:line="360"/>
+      </w:pPr>
+      <w:r>
+        <w:rPr>
+          <w:rFonts w:ascii="Arial" w:cs="Arial" w:eastAsia="Arial" w:hAnsi="Arial"/>
+        </w:rPr>
+        <w:t xml:space="preserve">About half of tool-run calls returned ok, and 44% of run calls were first attempts at that tool in the run. Retries were not consistently more successful than first attempts (Fig. 2b).</w:t>
+      </w:r>
+    </w:p>
+    <w:p>
+      <w:pPr>
+        <w:spacing w:after="160" w:line="360"/>
+      </w:pPr>
+      <w:r>
+        <w:rPr>
+          <w:rFonts w:ascii="Arial" w:cs="Arial" w:eastAsia="Arial" w:hAnsi="Arial"/>
+        </w:rPr>
+        <w:t xml:space="preserve">Returned excerpts often lacked diagnostic indicators when a job failed (Fig. 2c). Of failed user-defined-tool calls classified before execution, 1,320 of 1,320 lacked a diagnostic indicator in the extracted excerpt, as did nearly all equivalent installed-tool calls. Of runtime failures, 472 of 2,010 lacked such an indicator. The largest post-job class was a failed job with no diagnostic text (1,829 calls). Server-side causes were also hidden. On CompBioBench, 510 of 2,262 failed user-defined-tool calls occurred in the 72 runs whose traces show that Galaxy had no execution destination available. The interface never relayed that message; agents saw it only through the shell (Extended Data Fig. 3).</w:t>
+      </w:r>
+    </w:p>
+    <w:p>
+      <w:pPr>
+        <w:spacing w:after="160" w:line="360"/>
+      </w:pPr>
+      <w:r>
+        <w:rPr>
+          <w:rFonts w:ascii="Arial" w:cs="Arial" w:eastAsia="Arial" w:hAnsi="Arial"/>
+        </w:rPr>
+        <w:t xml:space="preserve">Finally, we followed non-ok tool-call episodes—the first non-ok call and later calls of that tool family within a run, with all user-defined tools treated as one family (Fig. 2d). Episodes include caught mismatches, timeouts and failed jobs. A later call returned ok in 58%, 49% and 44% of scored episodes. Final benchmark acceptance was assessed separately, and episodes without grades are reported in Source Data. Together, these results show that error categories did not uniquely identify phase and that failed-job excerpts frequently lacked diagnostics.</w:t>
       </w:r>
     </w:p>
     <w:p>
@@ -334,64 +347,64 @@
           <w:sz w:val="23"/>
           <w:szCs w:val="23"/>
         </w:rPr>
-        <w:t xml:space="preserve">Semantic fidelity: from requested to executed analysis</w:t>
-      </w:r>
-    </w:p>
-    <w:p>
-      <w:pPr>
-        <w:spacing w:after="160" w:line="360"/>
-      </w:pPr>
-      <w:r>
-        <w:rPr>
-          <w:rFonts w:ascii="Arial" w:cs="Arial" w:eastAsia="Arial" w:hAnsi="Arial"/>
-        </w:rPr>
-        <w:t xml:space="preserve">A job that finishes in the ok state need not have run the analysis that the agent requested. We classified each of 17,981 installed-tool run calls by whether, and how, its requested parameters were checked against what Galaxy resolved (Fig. 3a). Checks cover explicit requested parameters, not all scientific intent, defaults or output semantics. Across benchmarks, 43% to 56% of calls returned ok with a positive count of non-dataset parameters compared and matched. In 4% to 7% of calls (1,140 calls), ok accompanied no explicit non-dataset parameter to compare; another 3 ok calls had non-comparable parameter provenance. These are mostly format-conversion tools with no other parameters, but the class also contains resubmissions that addressed a conditional parameter in a way the comparison could not see. The absence of a parameter check is therefore neither automatic noncompliance nor evidence of full fidelity. A further 17% to 29% returned a pre-submission mismatch status, 6% to 10% returned a parameter or input mismatch status after execution, and 13% to 23% had other non-ok outcomes. These exclusive status groups do not exhaust overlapping mismatch flags.</w:t>
-      </w:r>
-    </w:p>
-    <w:p>
-      <w:pPr>
-        <w:spacing w:after="160" w:line="360"/>
-      </w:pPr>
-      <w:r>
-        <w:rPr>
-          <w:rFonts w:ascii="Arial" w:cs="Arial" w:eastAsia="Arial" w:hAnsi="Arial"/>
-        </w:rPr>
-        <w:t xml:space="preserve">Parameter-provenance flags identified 4,999 calls with mismatches: 74% before submission (3,709) and 1,290 after execution, including 251 with failed status. Separately, 213 calls had input-dataset mismatches; the parameter-or-input union was 5,065. Mismatch rates varied strongly between tools (Fig. 3b). Among 96 tools with at least 40 run calls, the ten highest had mismatches in 74% to 95% of calls, and 20 had none. These descriptive rates pool versions, tasks and models; they do not isolate wrapper effects.</w:t>
-      </w:r>
-    </w:p>
-    <w:p>
-      <w:pPr>
-        <w:spacing w:after="160" w:line="360"/>
-      </w:pPr>
-      <w:r>
-        <w:rPr>
-          <w:rFonts w:ascii="Arial" w:cs="Arial" w:eastAsia="Arial" w:hAnsi="Arial"/>
-        </w:rPr>
-        <w:t xml:space="preserve">Five audited mechanisms show how execution or interpretation departed from the request (Fig. 3c). On bix-35-q1, a conditional parameter was silently rebound to its default: the agent requested the metric "evolutionary rate", and Galaxy ran "total tree length" with job state ok. The adapter flagged the mismatch, and six of seven affected runs resubmitted. One resubmission addressed the branch by index, sent no comparable parameter and passed unchecked; that answer was wrong. On bix-28-q3, the output was a variance under the requested metric name; the suspected wrapper parsing mechanism is inferred because its source was not archived. On bix-45-q1, the wrapper did not show which PhyKIT version it ran</w:t>
+        <w:t xml:space="preserve">An ok job state did not ensure that the requested analysis ran</w:t>
+      </w:r>
+    </w:p>
+    <w:p>
+      <w:pPr>
+        <w:spacing w:after="160" w:line="360"/>
+      </w:pPr>
+      <w:r>
+        <w:rPr>
+          <w:rFonts w:ascii="Arial" w:cs="Arial" w:eastAsia="Arial" w:hAnsi="Arial"/>
+        </w:rPr>
+        <w:t xml:space="preserve">A job that finishes in the ok state need not have run the analysis that the agent requested. To measure semantic fidelity between request and execution, we classified each of 17,981 installed-tool run calls by whether, and how, its requested parameters were checked against what Galaxy resolved (Fig. 3a). The checks cover explicit requested parameters, not all scientific intent, defaults or output semantics. Across benchmarks, 43% to 56% of calls returned ok with a positive count of non-dataset parameters compared and matched. In 4% to 7% of calls (1,140 calls), ok accompanied no explicit non-dataset parameter to compare, and another 3 ok calls had non-comparable parameter provenance. Most were format-conversion tools with no other parameters. However, the class also contains resubmissions that addressed a conditional parameter in a way the comparison could not see. The absence of a parameter check is therefore neither automatic noncompliance nor evidence of full fidelity. A further 17% to 29% returned a pre-submission mismatch status, 6% to 10% a parameter or input mismatch status after execution and 13% to 23% other non-ok outcomes.</w:t>
+      </w:r>
+    </w:p>
+    <w:p>
+      <w:pPr>
+        <w:spacing w:after="160" w:line="360"/>
+      </w:pPr>
+      <w:r>
+        <w:rPr>
+          <w:rFonts w:ascii="Arial" w:cs="Arial" w:eastAsia="Arial" w:hAnsi="Arial"/>
+        </w:rPr>
+        <w:t xml:space="preserve">These exclusive status groups do not exhaust overlapping mismatch flags. Parameter-provenance flags identified 4,999 calls with mismatches: 74% before submission (3,709) and 1,290 after execution, including 251 with failed status. Separately, 213 calls had input-dataset mismatches; the parameter-or-input union was 5,065. Mismatch rates varied strongly between tools (Fig. 3b). Among 96 tools with at least 40 run calls, the ten highest had mismatches in 74% to 95% of calls, and 20 had none.</w:t>
+      </w:r>
+    </w:p>
+    <w:p>
+      <w:pPr>
+        <w:spacing w:after="160" w:line="360"/>
+      </w:pPr>
+      <w:r>
+        <w:rPr>
+          <w:rFonts w:ascii="Arial" w:cs="Arial" w:eastAsia="Arial" w:hAnsi="Arial"/>
+        </w:rPr>
+        <w:t xml:space="preserve">Five audited mechanisms show how execution or interpretation departed from the request (Fig. 3c). First, on bix-35-q1, a conditional parameter was silently rebound to its default: the agent requested the metric "evolutionary rate", and Galaxy ran "total tree length" with job state ok. The adapter flagged the mismatch, and six of seven affected runs resubmitted. One resubmission addressed the branch by index, sent no comparable parameter and passed unchecked; that answer was wrong. Second, on bix-28-q3, the output was a variance under the requested metric name; the suspected wrapper parsing mechanism is inferred because its source was not archived. Third, on bix-45-q1, the wrapper did not show which PhyKIT version it ran</w:t>
       </w:r>
       <w:r>
         <w:rPr>
           <w:rFonts w:ascii="Arial" w:cs="Arial" w:eastAsia="Arial" w:hAnsi="Arial"/>
           <w:vertAlign w:val="superscript"/>
         </w:rPr>
-        <w:t xml:space="preserve">23</w:t>
-      </w:r>
-      <w:r>
-        <w:rPr>
-          <w:rFonts w:ascii="Arial" w:cs="Arial" w:eastAsia="Arial" w:hAnsi="Arial"/>
-        </w:rPr>
-        <w:t xml:space="preserve">. Thirteen runs used the wrapper and two used user-defined tools. All 15 returned the current-definition value, judged scientifically defensible in the targeted audit, yet were scored incorrect against a retired-definition reference. On encode-atac-pipeline-q1, inputs staged without file extensions switched off adapter trimming without any error. On the IWC peptide-verification task, runs that used a legacy PepQuery wrapper scored lower than runs that used only the current version. This is an association: the order in which agents found the two versions was not controlled.</w:t>
-      </w:r>
-    </w:p>
-    <w:p>
-      <w:pPr>
-        <w:spacing w:after="160" w:line="360"/>
-      </w:pPr>
-      <w:r>
-        <w:rPr>
-          <w:rFonts w:ascii="Arial" w:cs="Arial" w:eastAsia="Arial" w:hAnsi="Arial"/>
-        </w:rPr>
-        <w:t xml:space="preserve">The targeted audit assigned Galaxy-related causes at three different units (Fig. 3d). In the targeted audit, Galaxy was a cause in 15 of 93 (8 as primary cause, 7 as contributing cause only) task cases. It was also a cause in 22 of 111 (4 as primary cause, 18 as contributing cause only) scored-incorrect BixBench-Verified-50 Galaxy runs, and it explained 4 of 21 replicate divergences.</w:t>
+        <w:t xml:space="preserve">24</w:t>
+      </w:r>
+      <w:r>
+        <w:rPr>
+          <w:rFonts w:ascii="Arial" w:cs="Arial" w:eastAsia="Arial" w:hAnsi="Arial"/>
+        </w:rPr>
+        <w:t xml:space="preserve">. Thirteen runs used the wrapper and two used user-defined tools. All 15 returned the current-definition value, judged scientifically defensible in the targeted audit, yet were scored incorrect against a retired-definition reference. Fourth, on encode-atac-pipeline-q1, inputs staged without file extensions switched off adapter trimming without any error. Fifth, on the IWC peptide-verification task, runs that used a legacy PepQuery wrapper scored lower than runs that used only the current version. This is an association, because the order in which agents found the two versions was not controlled.</w:t>
+      </w:r>
+    </w:p>
+    <w:p>
+      <w:pPr>
+        <w:spacing w:after="160" w:line="360"/>
+      </w:pPr>
+      <w:r>
+        <w:rPr>
+          <w:rFonts w:ascii="Arial" w:cs="Arial" w:eastAsia="Arial" w:hAnsi="Arial"/>
+        </w:rPr>
+        <w:t xml:space="preserve">The targeted audit assigned Galaxy-related causes at three different units (Fig. 3d). Galaxy was a cause in 15 of 93 (8 as primary cause, 7 as contributing cause only) task cases and in 22 of 111 (4 as primary cause, 18 as contributing cause only) scored-incorrect BixBench-Verified-50 Galaxy runs, and it explained 4 of 21 replicate divergences. These results show that an ok job state did not establish that the requested analysis ran or was interpreted as intended.</w:t>
       </w:r>
     </w:p>
     <w:p>
@@ -407,29 +420,29 @@
           <w:sz w:val="23"/>
           <w:szCs w:val="23"/>
         </w:rPr>
-        <w:t xml:space="preserve">Context consumption</w:t>
-      </w:r>
-    </w:p>
-    <w:p>
-      <w:pPr>
-        <w:spacing w:after="160" w:line="360"/>
-      </w:pPr>
-      <w:r>
-        <w:rPr>
-          <w:rFonts w:ascii="Arial" w:cs="Arial" w:eastAsia="Arial" w:hAnsi="Arial"/>
-        </w:rPr>
-        <w:t xml:space="preserve">Galaxy-arm runs used a median 5.2 (4.1 to 6.9), 4.4 (3.5 to 5.4) and 1.9 (0.8 to 4.9) times the input tokens of code-arm runs of the same task and configuration (Fig. 4a). The ratios were 2.4 (2.1 to 3.4), 2.9 (2.6 to 3.3) and 1.6 (1.2 to 1.9) for uncached input and 2.2 (1.8 to 2.8), 2.1 (1.8 to 2.2) and 1.1 (0.7 to 1.5) for output. Much of the difference was cached context re-read on each turn. The composition of returned text showed where the context went (Fig. 4b). Tool discovery, meaning search and inspection, made up 46%, 44% and 53% of interface calls but 70%, 43% and 51% of returned characters.</w:t>
-      </w:r>
-    </w:p>
-    <w:p>
-      <w:pPr>
-        <w:spacing w:after="160" w:line="360"/>
-      </w:pPr>
-      <w:r>
-        <w:rPr>
-          <w:rFonts w:ascii="Arial" w:cs="Arial" w:eastAsia="Arial" w:hAnsi="Arial"/>
-        </w:rPr>
-        <w:t xml:space="preserve">Input tokens rose with the number of actions in a run (Spearman correlations 0.89, 0.86 and 0.83; Fig. 4c), and many actions explored tools that were never used: of distinct tools that agents inspected, 45%, 47% and 53% were never run (Fig. 4d). The sibling-run token comparison did not detect an outcome difference (Fig. 4e). Within discordant BixBench-Verified-50 replicate sets, incorrect runs used as many input tokens as their correct siblings: the median ratio was 1.01 (P = 0.96; 28 sets) in the Galaxy arm and 0.99 (P = 0.74; 33 sets) in the code arm. These associations motivate testing compact discovery while retaining scientific quality; they do not exclude task difficulty or establish that interface changes reduce tokens. Tokens measure recorded context consumption, not complete monetary or computational cost.</w:t>
+        <w:t xml:space="preserve">Tool discovery accounted for a large share of the returned text</w:t>
+      </w:r>
+    </w:p>
+    <w:p>
+      <w:pPr>
+        <w:spacing w:after="160" w:line="360"/>
+      </w:pPr>
+      <w:r>
+        <w:rPr>
+          <w:rFonts w:ascii="Arial" w:cs="Arial" w:eastAsia="Arial" w:hAnsi="Arial"/>
+        </w:rPr>
+        <w:t xml:space="preserve">Galaxy-arm runs used a median 5.2 (4.1 to 6.9), 4.4 (3.5 to 5.4) and 1.9 (0.8 to 4.9) times the input tokens of code-arm runs of the same task and configuration (Fig. 4a). The ratios were 2.4 (2.1 to 3.4), 2.9 (2.6 to 3.3) and 1.6 (1.2 to 1.9) for uncached input and 2.2 (1.8 to 2.8), 2.1 (1.8 to 2.2) and 1.1 (0.7 to 1.5) for output. Much of the difference was cached context re-read on each turn. Tool discovery—search and inspection—made up 46%, 44% and 53% of interface calls but 70%, 43% and 51% of returned characters (Fig. 4b).</w:t>
+      </w:r>
+    </w:p>
+    <w:p>
+      <w:pPr>
+        <w:spacing w:after="160" w:line="360"/>
+      </w:pPr>
+      <w:r>
+        <w:rPr>
+          <w:rFonts w:ascii="Arial" w:cs="Arial" w:eastAsia="Arial" w:hAnsi="Arial"/>
+        </w:rPr>
+        <w:t xml:space="preserve">Input tokens rose with the number of actions in a run (Spearman correlations 0.89, 0.86 and 0.83; Fig. 4c). Many actions explored tools that were never used: of distinct tools that agents inspected, 45%, 47% and 53% were never run (Fig. 4d). Within discordant BixBench-Verified-50 replicate sets, incorrect runs used as many input tokens as their correct siblings (Fig. 4e): the median ratio was 1.01 (P = 0.96; 28 sets) in the Galaxy arm and 0.99 (P = 0.74; 33 sets) in the code arm. These results show where the context went and motivate testing compact discovery while retaining scientific quality.</w:t>
       </w:r>
     </w:p>
     <w:p>
@@ -445,40 +458,40 @@
           <w:sz w:val="23"/>
           <w:szCs w:val="23"/>
         </w:rPr>
-        <w:t xml:space="preserve">Execution attribution</w:t>
-      </w:r>
-    </w:p>
-    <w:p>
-      <w:pPr>
-        <w:spacing w:after="160" w:line="360"/>
-      </w:pPr>
-      <w:r>
-        <w:rPr>
-          <w:rFonts w:ascii="Arial" w:cs="Arial" w:eastAsia="Arial" w:hAnsi="Arial"/>
-        </w:rPr>
-        <w:t xml:space="preserve">The Galaxy-arm label records an assignment; it does not show that every operation ran inside Galaxy. In Codex traces, 41%, 33% and 34% of Galaxy-arm shell commands called the Galaxy API directly (Fig. 5a). Most of these calls downloaded full datasets, copied the seed history, fetched tool schemas or polled job state, indicating lifecycle operations to assess prospectively. In 268 runs, agents also submitted jobs by raw API request, which skips the adapter's parameter check while the job itself is still recorded by Galaxy. Jobs submitted through the API still have Galaxy provenance, while request validation bypasses the adapter. API reads do not establish where scientific computation occurred. We distinguish it from guard bypass, local computation and cross-run reuse, which differ in what the record can show.</w:t>
-      </w:r>
-    </w:p>
-    <w:p>
-      <w:pPr>
-        <w:spacing w:after="160" w:line="360"/>
-      </w:pPr>
-      <w:r>
-        <w:rPr>
-          <w:rFonts w:ascii="Arial" w:cs="Arial" w:eastAsia="Arial" w:hAnsi="Arial"/>
-        </w:rPr>
-        <w:t xml:space="preserve">Run-level evidence could not fully establish where computation happened (Fig. 5b). Runs with a detailed history and no analysis program named in the shell made up 62%, 74% and 43% of Galaxy runs. In most of the rest, the shell named an analysis program, which leaves the location of computation uncertain; a few runs had no detailed history. The targeted audit confirmed cases outside the boundary. In 18 CompBioBench runs, answers were computed locally after Galaxy execution of user-defined tools became unavailable, and in 2 runs answers were copied from other runs through the shared account. These are observed cases, not prevalence estimates.</w:t>
-      </w:r>
-    </w:p>
-    <w:p>
-      <w:pPr>
-        <w:spacing w:after="160" w:line="360"/>
-      </w:pPr>
-      <w:r>
-        <w:rPr>
-          <w:rFonts w:ascii="Arial" w:cs="Arial" w:eastAsia="Arial" w:hAnsi="Arial"/>
-        </w:rPr>
-        <w:t xml:space="preserve">User-defined tools brought agent-written code inside the boundary (Fig. 5c,d). The four Codex configurations requested them in 9% to 67% of Galaxy runs on BixBench-Verified-50 and 43% to 88% on CompBioBench. Of these calls, 57% and 50% returned ok. Final accepted outcomes in runs with a successful user-defined-tool job and runs without a request were, respectively, 91% (n = 246) versus 82% (n = 483) on BixBench-Verified-50 and 89% (n = 567) versus 88% (n = 380) on CompBioBench. Runs in which every such job failed had accepted outcomes in 82% (n = 240) on CompBioBench. These comparisons are associations across tasks and configurations.</w:t>
+        <w:t xml:space="preserve">The Galaxy-arm label did not establish where computation ran</w:t>
+      </w:r>
+    </w:p>
+    <w:p>
+      <w:pPr>
+        <w:spacing w:after="160" w:line="360"/>
+      </w:pPr>
+      <w:r>
+        <w:rPr>
+          <w:rFonts w:ascii="Arial" w:cs="Arial" w:eastAsia="Arial" w:hAnsi="Arial"/>
+        </w:rPr>
+        <w:t xml:space="preserve">In Codex traces, 41%, 33% and 34% of Galaxy-arm shell commands called the Galaxy API directly (Fig. 5a). Most of these calls downloaded full datasets, copied the seed history, fetched tool schemas or polled job state, indicating lifecycle operations to assess prospectively. In 268 runs, agents also submitted jobs by raw API request. Such jobs still have Galaxy provenance, but their requests bypass the adapter's parameter check. Because API reads do not establish where scientific computation occurred, we distinguish them from guard bypass, local computation and cross-run reuse, which differ in what the record can show.</w:t>
+      </w:r>
+    </w:p>
+    <w:p>
+      <w:pPr>
+        <w:spacing w:after="160" w:line="360"/>
+      </w:pPr>
+      <w:r>
+        <w:rPr>
+          <w:rFonts w:ascii="Arial" w:cs="Arial" w:eastAsia="Arial" w:hAnsi="Arial"/>
+        </w:rPr>
+        <w:t xml:space="preserve">Run-level evidence could not fully establish where computation happened (Fig. 5b). Runs with a detailed history and no analysis program named in the shell made up 62%, 74% and 43% of Galaxy runs. In most of the rest, the shell named an analysis program, which leaves the location of computation uncertain; a few runs had no detailed history. The targeted audit confirmed cases outside the boundary. In 18 CompBioBench runs, answers were computed locally after Galaxy execution of user-defined tools became unavailable. In 2 runs, answers were copied from other runs through the shared account.</w:t>
+      </w:r>
+    </w:p>
+    <w:p>
+      <w:pPr>
+        <w:spacing w:after="160" w:line="360"/>
+      </w:pPr>
+      <w:r>
+        <w:rPr>
+          <w:rFonts w:ascii="Arial" w:cs="Arial" w:eastAsia="Arial" w:hAnsi="Arial"/>
+        </w:rPr>
+        <w:t xml:space="preserve">User-defined tools brought agent-written code inside the boundary (Fig. 5c,d). The four Codex configurations requested them in 9% to 67% of Galaxy runs on BixBench-Verified-50 and 43% to 88% on CompBioBench, and 57% and 50% of these calls returned ok. Runs with a successful user-defined-tool job had final accepted outcomes in 91% (n = 246) on BixBench-Verified-50 and 89% (n = 567) on CompBioBench, compared with 82% (n = 483) and 88% (n = 380) in runs without a request. On CompBioBench, runs in which every such job failed had accepted outcomes in 82% (n = 240). These comparisons are associations across tasks and configurations. Together, these results show that the Galaxy-arm label records an assignment, not where every operation ran.</w:t>
       </w:r>
     </w:p>
     <w:p>
@@ -494,29 +507,29 @@
           <w:sz w:val="23"/>
           <w:szCs w:val="23"/>
         </w:rPr>
-        <w:t xml:space="preserve">Baseline agent-readiness measures and the requirements they motivate</w:t>
-      </w:r>
-    </w:p>
-    <w:p>
-      <w:pPr>
-        <w:spacing w:after="160" w:line="360"/>
-      </w:pPr>
-      <w:r>
-        <w:rPr>
-          <w:rFonts w:ascii="Arial" w:cs="Arial" w:eastAsia="Arial" w:hAnsi="Arial"/>
-        </w:rPr>
-        <w:t xml:space="preserve">We summarized the audit as eight baseline measures, each a proportion with a stated direction of improvement and a numerator and denominator in Supplementary Table 4 (Fig. 6a). By benchmark, the measures were as follows: run calls compared and matched, 45%, 56%, 43%; run calls with a recorded parameter mismatch, 37%, 23%, 35%; failed interface calls, 11%, 12%, 11%; failed-job excerpts with no diagnostic indicator, 21%, 63%, 58%; returned text spent on discovery, 70%, 43%, 51%; shell commands calling the Galaxy API directly, 41%, 33%, 34%; runs with a detailed analysis history, 95%, 100%, 98%; and user-defined-tool calls returning ok, 57%, 50%.</w:t>
-      </w:r>
-    </w:p>
-    <w:p>
-      <w:pPr>
-        <w:spacing w:after="160" w:line="360"/>
-      </w:pPr>
-      <w:r>
-        <w:rPr>
-          <w:rFonts w:ascii="Arial" w:cs="Arial" w:eastAsia="Arial" w:hAnsi="Arial"/>
-        </w:rPr>
-        <w:t xml:space="preserve">Each measure motivates a requirement on the workbench and an intervention that could test it (Fig. 6b). The interface should bind parameters strictly and return what will run, explain every failure in a structured form, and expose software versions and output semantics as tool metadata. It should also make discovery compact and independent of a history, cover the analysis life cycle so that agents need not script the API, and attest where computation ran with per-run isolation. None of these interventions was tested here. Supplementary Note 1 specifies, for each, a conformance test, the held-out tasks, the measure that should move and the replication on a second Galaxy deployment.</w:t>
+        <w:t xml:space="preserve">Eight baseline measures motivate six workbench requirements</w:t>
+      </w:r>
+    </w:p>
+    <w:p>
+      <w:pPr>
+        <w:spacing w:after="160" w:line="360"/>
+      </w:pPr>
+      <w:r>
+        <w:rPr>
+          <w:rFonts w:ascii="Arial" w:cs="Arial" w:eastAsia="Arial" w:hAnsi="Arial"/>
+        </w:rPr>
+        <w:t xml:space="preserve">We summarized the audit as eight baseline measures, each a proportion with a stated direction of improvement and a numerator and denominator in Supplementary Table 4 (Fig. 6a). By benchmark, the measures were: run calls compared and matched, 45%, 56%, 43%; run calls with a recorded parameter mismatch, 37%, 23%, 35%; failed interface calls, 11%, 12%, 11%; failed-job excerpts with no diagnostic indicator, 21%, 63%, 58%; returned text spent on discovery, 70%, 43%, 51%; shell commands calling the Galaxy API directly, 41%, 33%, 34%; runs with a detailed analysis history, 95%, 100%, 98%; and user-defined-tool calls returning ok, 57%, 50%.</w:t>
+      </w:r>
+    </w:p>
+    <w:p>
+      <w:pPr>
+        <w:spacing w:after="160" w:line="360"/>
+      </w:pPr>
+      <w:r>
+        <w:rPr>
+          <w:rFonts w:ascii="Arial" w:cs="Arial" w:eastAsia="Arial" w:hAnsi="Arial"/>
+        </w:rPr>
+        <w:t xml:space="preserve">Each measure motivates a requirement on the workbench and an intervention that could test it (Fig. 6b). The interface should (1) bind parameters strictly and return what will run, (2) explain every failure in a structured form, (3) expose software versions and output semantics as tool metadata, (4) make discovery compact and independent of a history, (5) cover the analysis life cycle so that agents need not script the API and (6) attest where computation ran, with per-run isolation. Supplementary Note 1 specifies, for each, a conformance test, the held-out tasks, the measure that should move and the replication on a second Galaxy deployment. None of these interventions was tested here, so the measures serve as baselines for prospective tests.</w:t>
       </w:r>
     </w:p>
     <w:p>
@@ -543,29 +556,29 @@
         <w:rPr>
           <w:rFonts w:ascii="Arial" w:cs="Arial" w:eastAsia="Arial" w:hAnsi="Arial"/>
         </w:rPr>
-        <w:t xml:space="preserve">Connecting an agent to a workbench does not by itself transfer the workbench's guarantees to the agent's analysis. In this archive, the guarantees broke down at four points. Agents could not always obtain a tool's interface; failed jobs often returned only a job-state summary; a job could run with parameters other than those requested; and agents moved work into the shell when the interface did not support an operation. The retained evidence supports baseline measures; prospective validation must determine whether changes resolve the failures.</w:t>
-      </w:r>
-    </w:p>
-    <w:p>
-      <w:pPr>
-        <w:spacing w:after="160" w:line="360"/>
-      </w:pPr>
-      <w:r>
-        <w:rPr>
-          <w:rFonts w:ascii="Arial" w:cs="Arial" w:eastAsia="Arial" w:hAnsi="Arial"/>
-        </w:rPr>
-        <w:t xml:space="preserve">Semantic fidelity is the property most specific to agents. A human user sees a tool form with its defaults and resolved conditionals; an agent sees a schema and a returned status. The adapter's requested-versus-resolved check caught most non-binding parameters before submission, but in 4% to 7% of installed-tool calls no explicit non-dataset parameter was compared. The bix-35-q1 resubmission also showed that a check comparing only what was sent can be bypassed without the comparator detecting it. A workbench that wants agents to use it correctly needs to return the resolved state before execution and treat unbound keys as errors.</w:t>
-      </w:r>
-    </w:p>
-    <w:p>
-      <w:pPr>
-        <w:spacing w:after="160" w:line="360"/>
-      </w:pPr>
-      <w:r>
-        <w:rPr>
-          <w:rFonts w:ascii="Arial" w:cs="Arial" w:eastAsia="Arial" w:hAnsi="Arial"/>
-        </w:rPr>
-        <w:t xml:space="preserve">Missing diagnostics and repeated interactions can increase context consumption, but this archive does not establish that causal chain. Discovery accounted for the largest share of returned text in two of three benchmarks, and about half of the inspected tools were never run. Compact, ranked tool cards and schemas that do not need a history would address both problems.</w:t>
+        <w:t xml:space="preserve">Connecting an agent to a workbench does not by itself transfer the workbench's guarantees to the agent's analysis. In this archive, the guarantees broke down at four points. First, agents could not always obtain a tool's interface. Second, failed jobs often returned only a job-state summary. Third, a job could run with parameters other than those requested. Fourth, agents moved work into the shell when the interface did not support an operation.</w:t>
+      </w:r>
+    </w:p>
+    <w:p>
+      <w:pPr>
+        <w:spacing w:after="160" w:line="360"/>
+      </w:pPr>
+      <w:r>
+        <w:rPr>
+          <w:rFonts w:ascii="Arial" w:cs="Arial" w:eastAsia="Arial" w:hAnsi="Arial"/>
+        </w:rPr>
+        <w:t xml:space="preserve">Semantic fidelity is the property most specific to agents. A human user sees a tool form with its defaults and resolved conditionals; an agent sees a schema and a returned status. The adapter's requested-versus-resolved check caught most non-binding parameters before submission. However, in 4% to 7% of installed-tool calls no explicit non-dataset parameter was compared. The bix-35-q1 resubmission also showed that a check comparing only what was sent can be bypassed without the comparator detecting it. A workbench should therefore return the resolved state before execution and treat unbound keys as errors.</w:t>
+      </w:r>
+    </w:p>
+    <w:p>
+      <w:pPr>
+        <w:spacing w:after="160" w:line="360"/>
+      </w:pPr>
+      <w:r>
+        <w:rPr>
+          <w:rFonts w:ascii="Arial" w:cs="Arial" w:eastAsia="Arial" w:hAnsi="Arial"/>
+        </w:rPr>
+        <w:t xml:space="preserve">Discovery accounted for the largest share of returned text in two of three benchmarks, and about half of the inspected tools were never run. Compact, ranked tool cards and schemas that do not need a history would address both problems. Missing diagnostics and repeated interactions can also increase context consumption, but this archive does not establish that causal chain.</w:t>
       </w:r>
     </w:p>
     <w:p>
@@ -583,35 +596,35 @@
           <w:rFonts w:ascii="Arial" w:cs="Arial" w:eastAsia="Arial" w:hAnsi="Arial"/>
           <w:vertAlign w:val="superscript"/>
         </w:rPr>
-        <w:t xml:space="preserve">15,24–26</w:t>
-      </w:r>
-      <w:r>
-        <w:rPr>
-          <w:rFonts w:ascii="Arial" w:cs="Arial" w:eastAsia="Arial" w:hAnsi="Arial"/>
-        </w:rPr>
-        <w:t xml:space="preserve">. Any system that compiles a typed request into an executed job faces the same questions. Did the request bind? What did the job run? Why did it fail? Where did the computation happen? We do not claim that the rates measured here transfer. They depend on Galaxy's tool catalogue, on this adapter and on the models that used it.</w:t>
-      </w:r>
-    </w:p>
-    <w:p>
-      <w:pPr>
-        <w:spacing w:after="160" w:line="360"/>
-      </w:pPr>
-      <w:r>
-        <w:rPr>
-          <w:rFonts w:ascii="Arial" w:cs="Arial" w:eastAsia="Arial" w:hAnsi="Arial"/>
-        </w:rPr>
-        <w:t xml:space="preserve">The study has limitations. It is retrospective and observational. We analysed archived adapter deployments on one public server over July to September with a shared account. Interface commits and runtime model metadata are incomplete, and catalogue and tool versions changed. Failure classes come from ordered rules applied to returned text, so classes with uninformative messages are undercounted. Recovery is defined at the level of tools and runs, not as a linked repair. The trace audit was AI-assisted, and its attribution counts cover targeted cases, not all runs. The requirements are hypotheses: each needs an intervention, a conformance test and replication on a second deployment, as specified in Supplementary Note 1, before it can be called validated.</w:t>
-      </w:r>
-    </w:p>
-    <w:p>
-      <w:pPr>
-        <w:spacing w:after="160" w:line="360"/>
-      </w:pPr>
-      <w:r>
-        <w:rPr>
-          <w:rFonts w:ascii="Arial" w:cs="Arial" w:eastAsia="Arial" w:hAnsi="Arial"/>
-        </w:rPr>
-        <w:t xml:space="preserve">Galaxy records substantial audit evidence, although history coverage is incomplete. The audited interface did not consistently expose that evidence while an analysis could still be corrected. The baseline measures in this study give developers of Galaxy and other workbenches a way to test whether such an interface works.</w:t>
+        <w:t xml:space="preserve">13,25–27</w:t>
+      </w:r>
+      <w:r>
+        <w:rPr>
+          <w:rFonts w:ascii="Arial" w:cs="Arial" w:eastAsia="Arial" w:hAnsi="Arial"/>
+        </w:rPr>
+        <w:t xml:space="preserve">. Any system that compiles a typed request into an executed job faces the same questions. Did the request bind? What did the job run? Why did it fail? Where did the computation happen?</w:t>
+      </w:r>
+    </w:p>
+    <w:p>
+      <w:pPr>
+        <w:spacing w:after="160" w:line="360"/>
+      </w:pPr>
+      <w:r>
+        <w:rPr>
+          <w:rFonts w:ascii="Arial" w:cs="Arial" w:eastAsia="Arial" w:hAnsi="Arial"/>
+        </w:rPr>
+        <w:t xml:space="preserve">This study has several limitations. First, the study is retrospective and observational, covers one public server used with a shared account and does not isolate a causal workbench effect. Interface commits and runtime model metadata are incomplete, and catalogue and tool versions changed and could not be frozen retrospectively. The rates depend on Galaxy's tool catalogue, this adapter and the models that used it, so they should not be assumed to transfer. Second, several measures are indirect. Failure classes come from ordered rules applied to returned text, so classes with uninformative messages are undercounted. The excerpt screen is a proxy for diagnostic visibility, not verification of complete result contents, and tokens measure recorded context, not complete monetary or computational cost. Third, recovery is defined at the level of tools and runs; neither later ok nor acceptance establishes repair of the failed step or retention of the same scientific goal. Fourth, comparisons are descriptive. Per-tool mismatch rates pool versions, tasks and models and do not isolate wrapper effects, and token associations neither exclude task difficulty nor show that interface changes reduce tokens. Fifth, the trace audit was AI-assisted and covered targeted cases, not all runs, so its attribution counts and confirmed cases are not prevalence estimates. Sixth, the requirements are untested hypotheses.</w:t>
+      </w:r>
+    </w:p>
+    <w:p>
+      <w:pPr>
+        <w:spacing w:after="160" w:line="360"/>
+      </w:pPr>
+      <w:r>
+        <w:rPr>
+          <w:rFonts w:ascii="Arial" w:cs="Arial" w:eastAsia="Arial" w:hAnsi="Arial"/>
+        </w:rPr>
+        <w:t xml:space="preserve">Galaxy records substantial audit evidence, although history coverage is incomplete. The audited interface did not consistently expose that evidence while an analysis could still be corrected. The baseline measures in this study give developers of Galaxy and other workbenches a way to test whether such an interface works. Future work should test each requirement prospectively, through the intervention, conformance test and second-deployment replication specified in Supplementary Note 1, before calling it validated.</w:t>
       </w:r>
     </w:p>
     <w:p>
@@ -810,41 +823,7 @@
         <w:rPr>
           <w:rFonts w:ascii="Arial" w:cs="Arial" w:eastAsia="Arial" w:hAnsi="Arial"/>
         </w:rPr>
-        <w:t xml:space="preserve">Mitchener, L. et al. BixBench: a comprehensive benchmark for LLM-based agents in computational biology. Preprint at https://doi.org/10.48550/arXiv.2503.00096 (2025).</w:t>
-      </w:r>
-    </w:p>
-    <w:p>
-      <w:pPr>
-        <w:spacing w:after="80" w:line="276"/>
-      </w:pPr>
-      <w:r>
-        <w:rPr>
-          <w:rFonts w:ascii="Arial" w:cs="Arial" w:eastAsia="Arial" w:hAnsi="Arial"/>
-        </w:rPr>
-        <w:t xml:space="preserve">6. </w:t>
-      </w:r>
-      <w:r>
-        <w:rPr>
-          <w:rFonts w:ascii="Arial" w:cs="Arial" w:eastAsia="Arial" w:hAnsi="Arial"/>
-        </w:rPr>
-        <w:t xml:space="preserve">Nair, S. et al. Agentic systems are adept at solving well-scoped, verifiable problems in computational biology. Preprint at bioRxiv https://doi.org/10.64898/2026.04.06.716850 (2026).</w:t>
-      </w:r>
-    </w:p>
-    <w:p>
-      <w:pPr>
-        <w:spacing w:after="80" w:line="276"/>
-      </w:pPr>
-      <w:r>
-        <w:rPr>
-          <w:rFonts w:ascii="Arial" w:cs="Arial" w:eastAsia="Arial" w:hAnsi="Arial"/>
-        </w:rPr>
-        <w:t xml:space="preserve">7. </w:t>
-      </w:r>
-      <w:r>
-        <w:rPr>
-          <w:rFonts w:ascii="Arial" w:cs="Arial" w:eastAsia="Arial" w:hAnsi="Arial"/>
-        </w:rPr>
-        <w:t xml:space="preserve">Jimenez, C. E. et al. SWE-bench: can language models resolve real-world GitHub issues? In </w:t>
+        <w:t xml:space="preserve">Messeri, L. &amp; Crockett, M. J. The uncritical adoption of AI in science is alarming — we urgently need guard rails. </w:t>
       </w:r>
       <w:r>
         <w:rPr>
@@ -852,13 +831,27 @@
           <w:i/>
           <w:iCs/>
         </w:rPr>
-        <w:t xml:space="preserve">Proc. 12th International Conference on Learning Representations</w:t>
-      </w:r>
-      <w:r>
-        <w:rPr>
-          <w:rFonts w:ascii="Arial" w:cs="Arial" w:eastAsia="Arial" w:hAnsi="Arial"/>
-        </w:rPr>
-        <w:t xml:space="preserve"> (ICLR, 2024).</w:t>
+        <w:t xml:space="preserve">Nature</w:t>
+      </w:r>
+      <w:r>
+        <w:rPr>
+          <w:rFonts w:ascii="Arial" w:cs="Arial" w:eastAsia="Arial" w:hAnsi="Arial"/>
+        </w:rPr>
+        <w:t xml:space="preserve"> </w:t>
+      </w:r>
+      <w:r>
+        <w:rPr>
+          <w:rFonts w:ascii="Arial" w:cs="Arial" w:eastAsia="Arial" w:hAnsi="Arial"/>
+          <w:b/>
+          <w:bCs/>
+        </w:rPr>
+        <w:t xml:space="preserve">653</w:t>
+      </w:r>
+      <w:r>
+        <w:rPr>
+          <w:rFonts w:ascii="Arial" w:cs="Arial" w:eastAsia="Arial" w:hAnsi="Arial"/>
+        </w:rPr>
+        <w:t xml:space="preserve">, 675–676 (2026).</w:t>
       </w:r>
     </w:p>
     <w:p>
@@ -869,7 +862,7 @@
         <w:rPr>
           <w:rFonts w:ascii="Arial" w:cs="Arial" w:eastAsia="Arial" w:hAnsi="Arial"/>
         </w:rPr>
-        <w:t xml:space="preserve">8. </w:t>
+        <w:t xml:space="preserve">6. </w:t>
       </w:r>
       <w:r>
         <w:rPr>
@@ -914,7 +907,7 @@
         <w:rPr>
           <w:rFonts w:ascii="Arial" w:cs="Arial" w:eastAsia="Arial" w:hAnsi="Arial"/>
         </w:rPr>
-        <w:t xml:space="preserve">9. </w:t>
+        <w:t xml:space="preserve">7. </w:t>
       </w:r>
       <w:r>
         <w:rPr>
@@ -959,7 +952,7 @@
         <w:rPr>
           <w:rFonts w:ascii="Arial" w:cs="Arial" w:eastAsia="Arial" w:hAnsi="Arial"/>
         </w:rPr>
-        <w:t xml:space="preserve">10. </w:t>
+        <w:t xml:space="preserve">8. </w:t>
       </w:r>
       <w:r>
         <w:rPr>
@@ -1004,7 +997,7 @@
         <w:rPr>
           <w:rFonts w:ascii="Arial" w:cs="Arial" w:eastAsia="Arial" w:hAnsi="Arial"/>
         </w:rPr>
-        <w:t xml:space="preserve">11. </w:t>
+        <w:t xml:space="preserve">9. </w:t>
       </w:r>
       <w:r>
         <w:rPr>
@@ -1049,7 +1042,7 @@
         <w:rPr>
           <w:rFonts w:ascii="Arial" w:cs="Arial" w:eastAsia="Arial" w:hAnsi="Arial"/>
         </w:rPr>
-        <w:t xml:space="preserve">12. </w:t>
+        <w:t xml:space="preserve">10. </w:t>
       </w:r>
       <w:r>
         <w:rPr>
@@ -1094,7 +1087,7 @@
         <w:rPr>
           <w:rFonts w:ascii="Arial" w:cs="Arial" w:eastAsia="Arial" w:hAnsi="Arial"/>
         </w:rPr>
-        <w:t xml:space="preserve">13. </w:t>
+        <w:t xml:space="preserve">11. </w:t>
       </w:r>
       <w:r>
         <w:rPr>
@@ -1139,7 +1132,7 @@
         <w:rPr>
           <w:rFonts w:ascii="Arial" w:cs="Arial" w:eastAsia="Arial" w:hAnsi="Arial"/>
         </w:rPr>
-        <w:t xml:space="preserve">14. </w:t>
+        <w:t xml:space="preserve">12. </w:t>
       </w:r>
       <w:r>
         <w:rPr>
@@ -1184,7 +1177,7 @@
         <w:rPr>
           <w:rFonts w:ascii="Arial" w:cs="Arial" w:eastAsia="Arial" w:hAnsi="Arial"/>
         </w:rPr>
-        <w:t xml:space="preserve">15. </w:t>
+        <w:t xml:space="preserve">13. </w:t>
       </w:r>
       <w:r>
         <w:rPr>
@@ -1229,7 +1222,7 @@
         <w:rPr>
           <w:rFonts w:ascii="Arial" w:cs="Arial" w:eastAsia="Arial" w:hAnsi="Arial"/>
         </w:rPr>
-        <w:t xml:space="preserve">16. </w:t>
+        <w:t xml:space="preserve">14. </w:t>
       </w:r>
       <w:r>
         <w:rPr>
@@ -1274,7 +1267,7 @@
         <w:rPr>
           <w:rFonts w:ascii="Arial" w:cs="Arial" w:eastAsia="Arial" w:hAnsi="Arial"/>
         </w:rPr>
-        <w:t xml:space="preserve">17. </w:t>
+        <w:t xml:space="preserve">15. </w:t>
       </w:r>
       <w:r>
         <w:rPr>
@@ -1319,7 +1312,7 @@
         <w:rPr>
           <w:rFonts w:ascii="Arial" w:cs="Arial" w:eastAsia="Arial" w:hAnsi="Arial"/>
         </w:rPr>
-        <w:t xml:space="preserve">18. </w:t>
+        <w:t xml:space="preserve">16. </w:t>
       </w:r>
       <w:r>
         <w:rPr>
@@ -1364,7 +1357,7 @@
         <w:rPr>
           <w:rFonts w:ascii="Arial" w:cs="Arial" w:eastAsia="Arial" w:hAnsi="Arial"/>
         </w:rPr>
-        <w:t xml:space="preserve">19. </w:t>
+        <w:t xml:space="preserve">17. </w:t>
       </w:r>
       <w:r>
         <w:rPr>
@@ -1409,7 +1402,7 @@
         <w:rPr>
           <w:rFonts w:ascii="Arial" w:cs="Arial" w:eastAsia="Arial" w:hAnsi="Arial"/>
         </w:rPr>
-        <w:t xml:space="preserve">20. </w:t>
+        <w:t xml:space="preserve">18. </w:t>
       </w:r>
       <w:r>
         <w:rPr>
@@ -1440,7 +1433,7 @@
         <w:rPr>
           <w:rFonts w:ascii="Arial" w:cs="Arial" w:eastAsia="Arial" w:hAnsi="Arial"/>
         </w:rPr>
-        <w:t xml:space="preserve">21. </w:t>
+        <w:t xml:space="preserve">19. </w:t>
       </w:r>
       <w:r>
         <w:rPr>
@@ -1471,7 +1464,7 @@
         <w:rPr>
           <w:rFonts w:ascii="Arial" w:cs="Arial" w:eastAsia="Arial" w:hAnsi="Arial"/>
         </w:rPr>
-        <w:t xml:space="preserve">22. </w:t>
+        <w:t xml:space="preserve">20. </w:t>
       </w:r>
       <w:r>
         <w:rPr>
@@ -1502,13 +1495,47 @@
         <w:rPr>
           <w:rFonts w:ascii="Arial" w:cs="Arial" w:eastAsia="Arial" w:hAnsi="Arial"/>
         </w:rPr>
+        <w:t xml:space="preserve">21. </w:t>
+      </w:r>
+      <w:r>
+        <w:rPr>
+          <w:rFonts w:ascii="Arial" w:cs="Arial" w:eastAsia="Arial" w:hAnsi="Arial"/>
+        </w:rPr>
+        <w:t xml:space="preserve">Mitchener, L. et al. BixBench: a comprehensive benchmark for LLM-based agents in computational biology. Preprint at https://doi.org/10.48550/arXiv.2503.00096 (2025).</w:t>
+      </w:r>
+    </w:p>
+    <w:p>
+      <w:pPr>
+        <w:spacing w:after="80" w:line="276"/>
+      </w:pPr>
+      <w:r>
+        <w:rPr>
+          <w:rFonts w:ascii="Arial" w:cs="Arial" w:eastAsia="Arial" w:hAnsi="Arial"/>
+        </w:rPr>
+        <w:t xml:space="preserve">22. </w:t>
+      </w:r>
+      <w:r>
+        <w:rPr>
+          <w:rFonts w:ascii="Arial" w:cs="Arial" w:eastAsia="Arial" w:hAnsi="Arial"/>
+        </w:rPr>
+        <w:t xml:space="preserve">Nair, S. et al. Agentic systems are adept at solving well-scoped, verifiable problems in computational biology. Preprint at bioRxiv https://doi.org/10.64898/2026.04.06.716850 (2026).</w:t>
+      </w:r>
+    </w:p>
+    <w:p>
+      <w:pPr>
+        <w:spacing w:after="80" w:line="276"/>
+      </w:pPr>
+      <w:r>
+        <w:rPr>
+          <w:rFonts w:ascii="Arial" w:cs="Arial" w:eastAsia="Arial" w:hAnsi="Arial"/>
+        </w:rPr>
         <w:t xml:space="preserve">23. </w:t>
       </w:r>
       <w:r>
         <w:rPr>
           <w:rFonts w:ascii="Arial" w:cs="Arial" w:eastAsia="Arial" w:hAnsi="Arial"/>
         </w:rPr>
-        <w:t xml:space="preserve">Steenwyk, J. L. et al. PhyKIT: a broadly applicable UNIX shell toolkit for processing and analyzing phylogenomic data. </w:t>
+        <w:t xml:space="preserve">Jimenez, C. E. et al. SWE-bench: can language models resolve real-world GitHub issues? In </w:t>
       </w:r>
       <w:r>
         <w:rPr>
@@ -1516,27 +1543,13 @@
           <w:i/>
           <w:iCs/>
         </w:rPr>
-        <w:t xml:space="preserve">Bioinformatics</w:t>
-      </w:r>
-      <w:r>
-        <w:rPr>
-          <w:rFonts w:ascii="Arial" w:cs="Arial" w:eastAsia="Arial" w:hAnsi="Arial"/>
-        </w:rPr>
-        <w:t xml:space="preserve"> </w:t>
-      </w:r>
-      <w:r>
-        <w:rPr>
-          <w:rFonts w:ascii="Arial" w:cs="Arial" w:eastAsia="Arial" w:hAnsi="Arial"/>
-          <w:b/>
-          <w:bCs/>
-        </w:rPr>
-        <w:t xml:space="preserve">37</w:t>
-      </w:r>
-      <w:r>
-        <w:rPr>
-          <w:rFonts w:ascii="Arial" w:cs="Arial" w:eastAsia="Arial" w:hAnsi="Arial"/>
-        </w:rPr>
-        <w:t xml:space="preserve">, 2325–2331 (2021).</w:t>
+        <w:t xml:space="preserve">Proc. 12th International Conference on Learning Representations</w:t>
+      </w:r>
+      <w:r>
+        <w:rPr>
+          <w:rFonts w:ascii="Arial" w:cs="Arial" w:eastAsia="Arial" w:hAnsi="Arial"/>
+        </w:rPr>
+        <w:t xml:space="preserve"> (ICLR, 2024).</w:t>
       </w:r>
     </w:p>
     <w:p>
@@ -1553,7 +1566,7 @@
         <w:rPr>
           <w:rFonts w:ascii="Arial" w:cs="Arial" w:eastAsia="Arial" w:hAnsi="Arial"/>
         </w:rPr>
-        <w:t xml:space="preserve">Berthold, M. R. et al. KNIME: the Konstanz Information Miner. In </w:t>
+        <w:t xml:space="preserve">Steenwyk, J. L. et al. PhyKIT: a broadly applicable UNIX shell toolkit for processing and analyzing phylogenomic data. </w:t>
       </w:r>
       <w:r>
         <w:rPr>
@@ -1561,13 +1574,27 @@
           <w:i/>
           <w:iCs/>
         </w:rPr>
-        <w:t xml:space="preserve">Data Analysis, Machine Learning and Applications</w:t>
-      </w:r>
-      <w:r>
-        <w:rPr>
-          <w:rFonts w:ascii="Arial" w:cs="Arial" w:eastAsia="Arial" w:hAnsi="Arial"/>
-        </w:rPr>
-        <w:t xml:space="preserve"> 319–326 (Springer, 2008).</w:t>
+        <w:t xml:space="preserve">Bioinformatics</w:t>
+      </w:r>
+      <w:r>
+        <w:rPr>
+          <w:rFonts w:ascii="Arial" w:cs="Arial" w:eastAsia="Arial" w:hAnsi="Arial"/>
+        </w:rPr>
+        <w:t xml:space="preserve"> </w:t>
+      </w:r>
+      <w:r>
+        <w:rPr>
+          <w:rFonts w:ascii="Arial" w:cs="Arial" w:eastAsia="Arial" w:hAnsi="Arial"/>
+          <w:b/>
+          <w:bCs/>
+        </w:rPr>
+        <w:t xml:space="preserve">37</w:t>
+      </w:r>
+      <w:r>
+        <w:rPr>
+          <w:rFonts w:ascii="Arial" w:cs="Arial" w:eastAsia="Arial" w:hAnsi="Arial"/>
+        </w:rPr>
+        <w:t xml:space="preserve">, 2325–2331 (2021).</w:t>
       </w:r>
     </w:p>
     <w:p>
@@ -1584,7 +1611,7 @@
         <w:rPr>
           <w:rFonts w:ascii="Arial" w:cs="Arial" w:eastAsia="Arial" w:hAnsi="Arial"/>
         </w:rPr>
-        <w:t xml:space="preserve">Kluyver, T. et al. Jupyter Notebooks—a publishing format for reproducible computational workflows. In </w:t>
+        <w:t xml:space="preserve">Berthold, M. R. et al. KNIME: the Konstanz Information Miner. In </w:t>
       </w:r>
       <w:r>
         <w:rPr>
@@ -1592,13 +1619,13 @@
           <w:i/>
           <w:iCs/>
         </w:rPr>
-        <w:t xml:space="preserve">Positioning and Power in Academic Publishing: Players, Agents and Agendas</w:t>
-      </w:r>
-      <w:r>
-        <w:rPr>
-          <w:rFonts w:ascii="Arial" w:cs="Arial" w:eastAsia="Arial" w:hAnsi="Arial"/>
-        </w:rPr>
-        <w:t xml:space="preserve"> 87–90 (IOS Press, 2016).</w:t>
+        <w:t xml:space="preserve">Data Analysis, Machine Learning and Applications</w:t>
+      </w:r>
+      <w:r>
+        <w:rPr>
+          <w:rFonts w:ascii="Arial" w:cs="Arial" w:eastAsia="Arial" w:hAnsi="Arial"/>
+        </w:rPr>
+        <w:t xml:space="preserve"> 319–326 (Springer, 2008).</w:t>
       </w:r>
     </w:p>
     <w:p>
@@ -1615,7 +1642,7 @@
         <w:rPr>
           <w:rFonts w:ascii="Arial" w:cs="Arial" w:eastAsia="Arial" w:hAnsi="Arial"/>
         </w:rPr>
-        <w:t xml:space="preserve">Wilkinson, M. D. et al. The FAIR Guiding Principles for scientific data management and stewardship. </w:t>
+        <w:t xml:space="preserve">Kluyver, T. et al. Jupyter Notebooks—a publishing format for reproducible computational workflows. In </w:t>
       </w:r>
       <w:r>
         <w:rPr>
@@ -1623,6 +1650,37 @@
           <w:i/>
           <w:iCs/>
         </w:rPr>
+        <w:t xml:space="preserve">Positioning and Power in Academic Publishing: Players, Agents and Agendas</w:t>
+      </w:r>
+      <w:r>
+        <w:rPr>
+          <w:rFonts w:ascii="Arial" w:cs="Arial" w:eastAsia="Arial" w:hAnsi="Arial"/>
+        </w:rPr>
+        <w:t xml:space="preserve"> 87–90 (IOS Press, 2016).</w:t>
+      </w:r>
+    </w:p>
+    <w:p>
+      <w:pPr>
+        <w:spacing w:after="80" w:line="276"/>
+      </w:pPr>
+      <w:r>
+        <w:rPr>
+          <w:rFonts w:ascii="Arial" w:cs="Arial" w:eastAsia="Arial" w:hAnsi="Arial"/>
+        </w:rPr>
+        <w:t xml:space="preserve">27. </w:t>
+      </w:r>
+      <w:r>
+        <w:rPr>
+          <w:rFonts w:ascii="Arial" w:cs="Arial" w:eastAsia="Arial" w:hAnsi="Arial"/>
+        </w:rPr>
+        <w:t xml:space="preserve">Wilkinson, M. D. et al. The FAIR Guiding Principles for scientific data management and stewardship. </w:t>
+      </w:r>
+      <w:r>
+        <w:rPr>
+          <w:rFonts w:ascii="Arial" w:cs="Arial" w:eastAsia="Arial" w:hAnsi="Arial"/>
+          <w:i/>
+          <w:iCs/>
+        </w:rPr>
         <w:t xml:space="preserve">Sci. Data</w:t>
       </w:r>
       <w:r>
@@ -2122,7 +2180,7 @@
           <w:rFonts w:ascii="Arial" w:cs="Arial" w:eastAsia="Arial" w:hAnsi="Arial"/>
           <w:vertAlign w:val="superscript"/>
         </w:rPr>
-        <w:t xml:space="preserve">5</w:t>
+        <w:t xml:space="preserve">21</w:t>
       </w:r>
       <w:r>
         <w:rPr>
@@ -2135,7 +2193,7 @@
           <w:rFonts w:ascii="Arial" w:cs="Arial" w:eastAsia="Arial" w:hAnsi="Arial"/>
           <w:vertAlign w:val="superscript"/>
         </w:rPr>
-        <w:t xml:space="preserve">6</w:t>
+        <w:t xml:space="preserve">22</w:t>
       </w:r>
       <w:r>
         <w:rPr>
@@ -2324,7 +2382,7 @@
           <w:rFonts w:ascii="Arial" w:cs="Arial" w:eastAsia="Arial" w:hAnsi="Arial"/>
           <w:vertAlign w:val="superscript"/>
         </w:rPr>
-        <w:t xml:space="preserve">27</w:t>
+        <w:t xml:space="preserve">28</w:t>
       </w:r>
       <w:r>
         <w:rPr>
@@ -2446,7 +2504,7 @@
           <w:rFonts w:ascii="Arial" w:cs="Arial" w:eastAsia="Arial" w:hAnsi="Arial"/>
           <w:vertAlign w:val="superscript"/>
         </w:rPr>
-        <w:t xml:space="preserve">28</w:t>
+        <w:t xml:space="preserve">29</w:t>
       </w:r>
       <w:r>
         <w:rPr>
@@ -2527,7 +2585,7 @@
           <w:rFonts w:ascii="Arial" w:cs="Arial" w:eastAsia="Arial" w:hAnsi="Arial"/>
           <w:vertAlign w:val="superscript"/>
         </w:rPr>
-        <w:t xml:space="preserve">29</w:t>
+        <w:t xml:space="preserve">30</w:t>
       </w:r>
       <w:r>
         <w:rPr>
@@ -2712,7 +2770,7 @@
         <w:rPr>
           <w:rFonts w:ascii="Arial" w:cs="Arial" w:eastAsia="Arial" w:hAnsi="Arial"/>
         </w:rPr>
-        <w:t xml:space="preserve">27. </w:t>
+        <w:t xml:space="preserve">28. </w:t>
       </w:r>
       <w:r>
         <w:rPr>
@@ -2757,7 +2815,7 @@
         <w:rPr>
           <w:rFonts w:ascii="Arial" w:cs="Arial" w:eastAsia="Arial" w:hAnsi="Arial"/>
         </w:rPr>
-        <w:t xml:space="preserve">28. </w:t>
+        <w:t xml:space="preserve">29. </w:t>
       </w:r>
       <w:r>
         <w:rPr>
@@ -2788,7 +2846,7 @@
         <w:rPr>
           <w:rFonts w:ascii="Arial" w:cs="Arial" w:eastAsia="Arial" w:hAnsi="Arial"/>
         </w:rPr>
-        <w:t xml:space="preserve">29. </w:t>
+        <w:t xml:space="preserve">30. </w:t>
       </w:r>
       <w:r>
         <w:rPr>

</xml_diff>